<commit_message>
Remove opcao de compra na infra DriveData: agora 2 opcoes (A=infra Unilever, B=SaaS)
Alinha proposta e documento tecnico: Opcao/Cenario A = infra Unilever,
Opcao/Cenario B = infra DriveData (SaaS). Diagramas e comparativos ajustados.

Co-Authored-By: Claude Opus 4.8 <noreply@anthropic.com>
</commit_message>
<xml_diff>
--- a/Arquitetura_Tecnica_Passaporte_de_Seguranca.docx
+++ b/Arquitetura_Tecnica_Passaporte_de_Seguranca.docx
@@ -833,7 +833,7 @@
           <w:sz w:val="28"/>
           <w:szCs w:val="28"/>
         </w:rPr>
-        <w:t xml:space="preserve">3. Cenário A — Infraestrutura gerenciada pela DriveData</w:t>
+        <w:t xml:space="preserve">3. Cenário A — Infraestrutura da Unilever</w:t>
       </w:r>
     </w:p>
     <w:p>
@@ -847,7 +847,7 @@
           <w:sz w:val="21"/>
           <w:szCs w:val="21"/>
         </w:rPr>
-        <w:t xml:space="preserve">O sistema roda na nuvem gerenciada pela DriveData e lê a base consolidada no SharePoint da Unilever.</w:t>
+        <w:t xml:space="preserve">O sistema roda inteiramente no ambiente da Unilever (on-premise). O dado não sai da rede interna. Apenas a consulta do colaborador é publicada para fora.</w:t>
       </w:r>
     </w:p>
     <w:p>
@@ -858,7 +858,7 @@
       <w:r>
         <w:drawing>
           <wp:inline distT="0" distB="0" distL="0" distR="0">
-            <wp:extent cx="5715000" cy="2714625"/>
+            <wp:extent cx="5715000" cy="2905125"/>
             <wp:effectExtent t="0" r="0" b="0" l="0"/>
             <wp:docPr id="1" name="" descr="" title=""/>
             <wp:cNvGraphicFramePr>
@@ -883,7 +883,7 @@
                   <pic:spPr bwMode="auto">
                     <a:xfrm>
                       <a:off x="0" y="0"/>
-                      <a:ext cx="5715000" cy="2714625"/>
+                      <a:ext cx="5715000" cy="2905125"/>
                     </a:xfrm>
                     <a:prstGeom prst="rect">
                       <a:avLst/>
@@ -1035,7 +1035,7 @@
                 <w:sz w:val="17"/>
                 <w:szCs w:val="17"/>
               </w:rPr>
-              <w:t xml:space="preserve">Hospedagem do app</w:t>
+              <w:t xml:space="preserve">Servidor de aplicação</w:t>
             </w:r>
           </w:p>
         </w:tc>
@@ -1063,7 +1063,7 @@
                 <w:sz w:val="17"/>
                 <w:szCs w:val="17"/>
               </w:rPr>
-              <w:t xml:space="preserve">Plataforma gerenciada (ex.: Vercel), HTTPS</w:t>
+              <w:t xml:space="preserve">VM Linux com container (Docker)</w:t>
             </w:r>
           </w:p>
         </w:tc>
@@ -1091,7 +1091,7 @@
                 <w:sz w:val="17"/>
                 <w:szCs w:val="17"/>
               </w:rPr>
-              <w:t xml:space="preserve">DriveData</w:t>
+              <w:t xml:space="preserve">Unilever provê · DriveData configura</w:t>
             </w:r>
           </w:p>
         </w:tc>
@@ -1149,7 +1149,7 @@
                 <w:sz w:val="17"/>
                 <w:szCs w:val="17"/>
               </w:rPr>
-              <w:t xml:space="preserve">PostgreSQL gerenciado</w:t>
+              <w:t xml:space="preserve">PostgreSQL ou SQL Server da Unilever</w:t>
             </w:r>
           </w:p>
         </w:tc>
@@ -1177,7 +1177,7 @@
                 <w:sz w:val="17"/>
                 <w:szCs w:val="17"/>
               </w:rPr>
-              <w:t xml:space="preserve">DriveData</w:t>
+              <w:t xml:space="preserve">Unilever</w:t>
             </w:r>
           </w:p>
         </w:tc>
@@ -1235,7 +1235,7 @@
                 <w:sz w:val="17"/>
                 <w:szCs w:val="17"/>
               </w:rPr>
-              <w:t xml:space="preserve">Rotina agendada via Graph API (leitura)</w:t>
+              <w:t xml:space="preserve">Job agendado no ambiente da Unilever</w:t>
             </w:r>
           </w:p>
         </w:tc>
@@ -1263,7 +1263,7 @@
                 <w:sz w:val="17"/>
                 <w:szCs w:val="17"/>
               </w:rPr>
-              <w:t xml:space="preserve">DriveData</w:t>
+              <w:t xml:space="preserve">DriveData configura</w:t>
             </w:r>
           </w:p>
         </w:tc>
@@ -1293,7 +1293,7 @@
                 <w:sz w:val="17"/>
                 <w:szCs w:val="17"/>
               </w:rPr>
-              <w:t xml:space="preserve">Acesso ao SharePoint</w:t>
+              <w:t xml:space="preserve">Exposição da consulta</w:t>
             </w:r>
           </w:p>
         </w:tc>
@@ -1321,7 +1321,7 @@
                 <w:sz w:val="17"/>
                 <w:szCs w:val="17"/>
               </w:rPr>
-              <w:t xml:space="preserve">App Registration (Entra ID), permissão mínima de leitura</w:t>
+              <w:t xml:space="preserve">Reverse proxy / DMZ com HTTPS</w:t>
             </w:r>
           </w:p>
         </w:tc>
@@ -1349,7 +1349,7 @@
                 <w:sz w:val="17"/>
                 <w:szCs w:val="17"/>
               </w:rPr>
-              <w:t xml:space="preserve">Unilever provê · DriveData consome</w:t>
+              <w:t xml:space="preserve">Unilever (rede / segurança)</w:t>
             </w:r>
           </w:p>
         </w:tc>
@@ -1436,6 +1436,92 @@
                 <w:szCs w:val="17"/>
               </w:rPr>
               <w:t xml:space="preserve">DriveData</w:t>
+            </w:r>
+          </w:p>
+        </w:tc>
+      </w:tr>
+      <w:tr>
+        <w:tc>
+          <w:tcPr>
+            <w:tcW w:type="dxa" w:w="2300"/>
+            <w:shd w:fill="F4F6FB" w:color="auto" w:val="clear"/>
+            <w:tcMar>
+              <w:top w:type="dxa" w:w="50"/>
+              <w:left w:type="dxa" w:w="90"/>
+              <w:bottom w:type="dxa" w:w="50"/>
+              <w:right w:type="dxa" w:w="90"/>
+            </w:tcMar>
+          </w:tcPr>
+          <w:p>
+            <w:pPr>
+              <w:spacing w:after="0" w:line="250"/>
+            </w:pPr>
+            <w:r>
+              <w:rPr>
+                <w:rFonts w:ascii="Calibri" w:cs="Calibri" w:eastAsia="Calibri" w:hAnsi="Calibri"/>
+                <w:b/>
+                <w:bCs/>
+                <w:color w:val="23272F"/>
+                <w:sz w:val="17"/>
+                <w:szCs w:val="17"/>
+              </w:rPr>
+              <w:t xml:space="preserve">Pipeline de deploy</w:t>
+            </w:r>
+          </w:p>
+        </w:tc>
+        <w:tc>
+          <w:tcPr>
+            <w:tcW w:type="dxa" w:w="3520"/>
+            <w:shd w:fill="F4F6FB" w:color="auto" w:val="clear"/>
+            <w:tcMar>
+              <w:top w:type="dxa" w:w="50"/>
+              <w:left w:type="dxa" w:w="90"/>
+              <w:bottom w:type="dxa" w:w="50"/>
+              <w:right w:type="dxa" w:w="90"/>
+            </w:tcMar>
+          </w:tcPr>
+          <w:p>
+            <w:pPr>
+              <w:spacing w:after="0" w:line="250"/>
+            </w:pPr>
+            <w:r>
+              <w:rPr>
+                <w:rFonts w:ascii="Calibri" w:cs="Calibri" w:eastAsia="Calibri" w:hAnsi="Calibri"/>
+                <w:b w:val="false"/>
+                <w:bCs w:val="false"/>
+                <w:color w:val="23272F"/>
+                <w:sz w:val="17"/>
+                <w:szCs w:val="17"/>
+              </w:rPr>
+              <w:t xml:space="preserve">GitHub Actions ou Azure DevOps</w:t>
+            </w:r>
+          </w:p>
+        </w:tc>
+        <w:tc>
+          <w:tcPr>
+            <w:tcW w:type="dxa" w:w="2400"/>
+            <w:shd w:fill="F4F6FB" w:color="auto" w:val="clear"/>
+            <w:tcMar>
+              <w:top w:type="dxa" w:w="50"/>
+              <w:left w:type="dxa" w:w="90"/>
+              <w:bottom w:type="dxa" w:w="50"/>
+              <w:right w:type="dxa" w:w="90"/>
+            </w:tcMar>
+          </w:tcPr>
+          <w:p>
+            <w:pPr>
+              <w:spacing w:after="0" w:line="250"/>
+            </w:pPr>
+            <w:r>
+              <w:rPr>
+                <w:rFonts w:ascii="Calibri" w:cs="Calibri" w:eastAsia="Calibri" w:hAnsi="Calibri"/>
+                <w:b w:val="false"/>
+                <w:bCs w:val="false"/>
+                <w:color w:val="23272F"/>
+                <w:sz w:val="17"/>
+                <w:szCs w:val="17"/>
+              </w:rPr>
+              <w:t xml:space="preserve">A acordar</w:t>
             </w:r>
           </w:p>
         </w:tc>
@@ -1474,7 +1560,7 @@
           <w:sz w:val="21"/>
           <w:szCs w:val="21"/>
         </w:rPr>
-        <w:t xml:space="preserve">App Registration com leitura no site do SharePoint da base.</w:t>
+        <w:t xml:space="preserve">Servidor (VM Linux) para hospedar a aplicação e permissão para uso de container.</w:t>
       </w:r>
     </w:p>
     <w:p>
@@ -1493,7 +1579,7 @@
           <w:sz w:val="21"/>
           <w:szCs w:val="21"/>
         </w:rPr>
-        <w:t xml:space="preserve">Lista inicial dos usuários da equipe e seus perfis.</w:t>
+        <w:t xml:space="preserve">Banco de dados (PostgreSQL ou SQL Server) e credenciais com privilégio adequado.</w:t>
       </w:r>
     </w:p>
     <w:p>
@@ -1512,7 +1598,45 @@
           <w:sz w:val="21"/>
           <w:szCs w:val="21"/>
         </w:rPr>
-        <w:t xml:space="preserve">Subdomínio para publicação (opcional).</w:t>
+        <w:t xml:space="preserve">Acesso de leitura ao SharePoint.</w:t>
+      </w:r>
+    </w:p>
+    <w:p>
+      <w:pPr>
+        <w:pStyle w:val="ListParagraph"/>
+        <w:numPr>
+          <w:ilvl w:val="0"/>
+          <w:numId w:val="1"/>
+        </w:numPr>
+        <w:spacing w:after="60" w:line="270"/>
+      </w:pPr>
+      <w:r>
+        <w:rPr>
+          <w:rFonts w:ascii="Calibri" w:cs="Calibri" w:eastAsia="Calibri" w:hAnsi="Calibri"/>
+          <w:color w:val="23272F"/>
+          <w:sz w:val="21"/>
+          <w:szCs w:val="21"/>
+        </w:rPr>
+        <w:t xml:space="preserve">Publicação segura da consulta do colaborador (reverse proxy / DMZ).</w:t>
+      </w:r>
+    </w:p>
+    <w:p>
+      <w:pPr>
+        <w:pStyle w:val="ListParagraph"/>
+        <w:numPr>
+          <w:ilvl w:val="0"/>
+          <w:numId w:val="1"/>
+        </w:numPr>
+        <w:spacing w:after="60" w:line="270"/>
+      </w:pPr>
+      <w:r>
+        <w:rPr>
+          <w:rFonts w:ascii="Calibri" w:cs="Calibri" w:eastAsia="Calibri" w:hAnsi="Calibri"/>
+          <w:color w:val="23272F"/>
+          <w:sz w:val="21"/>
+          <w:szCs w:val="21"/>
+        </w:rPr>
+        <w:t xml:space="preserve">Pipeline de deploy aceito e pontos focais de rede e segurança.</w:t>
       </w:r>
     </w:p>
     <w:p>
@@ -1529,7 +1653,7 @@
           <w:sz w:val="23"/>
           <w:szCs w:val="23"/>
         </w:rPr>
-        <w:t xml:space="preserve">Consideração</w:t>
+        <w:t xml:space="preserve">Ponto de atenção</w:t>
       </w:r>
     </w:p>
     <w:p>
@@ -1543,7 +1667,7 @@
           <w:sz w:val="21"/>
           <w:szCs w:val="21"/>
         </w:rPr>
-        <w:t xml:space="preserve">Uma cópia tratada dos dados fica no ambiente da DriveData. É o cenário de menor esforço e prazo, e a consulta do colaborador já é acessível pela internet.</w:t>
+        <w:t xml:space="preserve">A consulta é feita no celular pessoal do colaborador, fora da rede. Para funcionar, a aplicação precisa ser publicada para a internet por um reverse proxy / DMZ. Se a exposição externa não for permitida, a consulta fica restrita a dispositivos internos, o que altera o escopo.</w:t>
       </w:r>
     </w:p>
     <w:p>
@@ -1560,7 +1684,7 @@
           <w:sz w:val="28"/>
           <w:szCs w:val="28"/>
         </w:rPr>
-        <w:t xml:space="preserve">4. Cenário B — Infraestrutura da Unilever</w:t>
+        <w:t xml:space="preserve">4. Cenário B — Infraestrutura gerenciada pela DriveData</w:t>
       </w:r>
     </w:p>
     <w:p>
@@ -1574,7 +1698,7 @@
           <w:sz w:val="21"/>
           <w:szCs w:val="21"/>
         </w:rPr>
-        <w:t xml:space="preserve">O sistema roda inteiramente no ambiente da Unilever (on-premise ou Azure). O dado não sai da rede interna. Apenas a consulta do colaborador é publicada para fora.</w:t>
+        <w:t xml:space="preserve">O sistema roda na nuvem gerenciada pela DriveData e lê a base consolidada no SharePoint da Unilever.</w:t>
       </w:r>
     </w:p>
     <w:p>
@@ -1585,7 +1709,7 @@
       <w:r>
         <w:drawing>
           <wp:inline distT="0" distB="0" distL="0" distR="0">
-            <wp:extent cx="5715000" cy="2905125"/>
+            <wp:extent cx="5715000" cy="2714625"/>
             <wp:effectExtent t="0" r="0" b="0" l="0"/>
             <wp:docPr id="1" name="" descr="" title=""/>
             <wp:cNvGraphicFramePr>
@@ -1610,7 +1734,7 @@
                   <pic:spPr bwMode="auto">
                     <a:xfrm>
                       <a:off x="0" y="0"/>
-                      <a:ext cx="5715000" cy="2905125"/>
+                      <a:ext cx="5715000" cy="2714625"/>
                     </a:xfrm>
                     <a:prstGeom prst="rect">
                       <a:avLst/>
@@ -1762,7 +1886,7 @@
                 <w:sz w:val="17"/>
                 <w:szCs w:val="17"/>
               </w:rPr>
-              <w:t xml:space="preserve">Servidor de aplicação</w:t>
+              <w:t xml:space="preserve">Hospedagem do app</w:t>
             </w:r>
           </w:p>
         </w:tc>
@@ -1790,7 +1914,7 @@
                 <w:sz w:val="17"/>
                 <w:szCs w:val="17"/>
               </w:rPr>
-              <w:t xml:space="preserve">VM Linux com container (Docker)</w:t>
+              <w:t xml:space="preserve">Plataforma gerenciada, HTTPS</w:t>
             </w:r>
           </w:p>
         </w:tc>
@@ -1818,7 +1942,7 @@
                 <w:sz w:val="17"/>
                 <w:szCs w:val="17"/>
               </w:rPr>
-              <w:t xml:space="preserve">Unilever provê · DriveData configura</w:t>
+              <w:t xml:space="preserve">DriveData</w:t>
             </w:r>
           </w:p>
         </w:tc>
@@ -1876,7 +2000,7 @@
                 <w:sz w:val="17"/>
                 <w:szCs w:val="17"/>
               </w:rPr>
-              <w:t xml:space="preserve">PostgreSQL ou SQL Server da Unilever</w:t>
+              <w:t xml:space="preserve">PostgreSQL gerenciado</w:t>
             </w:r>
           </w:p>
         </w:tc>
@@ -1904,7 +2028,7 @@
                 <w:sz w:val="17"/>
                 <w:szCs w:val="17"/>
               </w:rPr>
-              <w:t xml:space="preserve">Unilever</w:t>
+              <w:t xml:space="preserve">DriveData</w:t>
             </w:r>
           </w:p>
         </w:tc>
@@ -1962,7 +2086,7 @@
                 <w:sz w:val="17"/>
                 <w:szCs w:val="17"/>
               </w:rPr>
-              <w:t xml:space="preserve">Job agendado no ambiente da Unilever</w:t>
+              <w:t xml:space="preserve">Rotina agendada via Graph API (leitura)</w:t>
             </w:r>
           </w:p>
         </w:tc>
@@ -1990,7 +2114,7 @@
                 <w:sz w:val="17"/>
                 <w:szCs w:val="17"/>
               </w:rPr>
-              <w:t xml:space="preserve">DriveData configura</w:t>
+              <w:t xml:space="preserve">DriveData</w:t>
             </w:r>
           </w:p>
         </w:tc>
@@ -2020,7 +2144,7 @@
                 <w:sz w:val="17"/>
                 <w:szCs w:val="17"/>
               </w:rPr>
-              <w:t xml:space="preserve">Exposição da consulta</w:t>
+              <w:t xml:space="preserve">Acesso ao SharePoint</w:t>
             </w:r>
           </w:p>
         </w:tc>
@@ -2048,7 +2172,7 @@
                 <w:sz w:val="17"/>
                 <w:szCs w:val="17"/>
               </w:rPr>
-              <w:t xml:space="preserve">Reverse proxy / DMZ com HTTPS</w:t>
+              <w:t xml:space="preserve">App Registration (Entra ID), permissão mínima de leitura</w:t>
             </w:r>
           </w:p>
         </w:tc>
@@ -2076,7 +2200,7 @@
                 <w:sz w:val="17"/>
                 <w:szCs w:val="17"/>
               </w:rPr>
-              <w:t xml:space="preserve">Unilever (rede / segurança)</w:t>
+              <w:t xml:space="preserve">Unilever provê · DriveData consome</w:t>
             </w:r>
           </w:p>
         </w:tc>
@@ -2163,92 +2287,6 @@
                 <w:szCs w:val="17"/>
               </w:rPr>
               <w:t xml:space="preserve">DriveData</w:t>
-            </w:r>
-          </w:p>
-        </w:tc>
-      </w:tr>
-      <w:tr>
-        <w:tc>
-          <w:tcPr>
-            <w:tcW w:type="dxa" w:w="2300"/>
-            <w:shd w:fill="F4F6FB" w:color="auto" w:val="clear"/>
-            <w:tcMar>
-              <w:top w:type="dxa" w:w="50"/>
-              <w:left w:type="dxa" w:w="90"/>
-              <w:bottom w:type="dxa" w:w="50"/>
-              <w:right w:type="dxa" w:w="90"/>
-            </w:tcMar>
-          </w:tcPr>
-          <w:p>
-            <w:pPr>
-              <w:spacing w:after="0" w:line="250"/>
-            </w:pPr>
-            <w:r>
-              <w:rPr>
-                <w:rFonts w:ascii="Calibri" w:cs="Calibri" w:eastAsia="Calibri" w:hAnsi="Calibri"/>
-                <w:b/>
-                <w:bCs/>
-                <w:color w:val="23272F"/>
-                <w:sz w:val="17"/>
-                <w:szCs w:val="17"/>
-              </w:rPr>
-              <w:t xml:space="preserve">Pipeline de deploy</w:t>
-            </w:r>
-          </w:p>
-        </w:tc>
-        <w:tc>
-          <w:tcPr>
-            <w:tcW w:type="dxa" w:w="3520"/>
-            <w:shd w:fill="F4F6FB" w:color="auto" w:val="clear"/>
-            <w:tcMar>
-              <w:top w:type="dxa" w:w="50"/>
-              <w:left w:type="dxa" w:w="90"/>
-              <w:bottom w:type="dxa" w:w="50"/>
-              <w:right w:type="dxa" w:w="90"/>
-            </w:tcMar>
-          </w:tcPr>
-          <w:p>
-            <w:pPr>
-              <w:spacing w:after="0" w:line="250"/>
-            </w:pPr>
-            <w:r>
-              <w:rPr>
-                <w:rFonts w:ascii="Calibri" w:cs="Calibri" w:eastAsia="Calibri" w:hAnsi="Calibri"/>
-                <w:b w:val="false"/>
-                <w:bCs w:val="false"/>
-                <w:color w:val="23272F"/>
-                <w:sz w:val="17"/>
-                <w:szCs w:val="17"/>
-              </w:rPr>
-              <w:t xml:space="preserve">GitHub Actions ou Azure DevOps</w:t>
-            </w:r>
-          </w:p>
-        </w:tc>
-        <w:tc>
-          <w:tcPr>
-            <w:tcW w:type="dxa" w:w="2400"/>
-            <w:shd w:fill="F4F6FB" w:color="auto" w:val="clear"/>
-            <w:tcMar>
-              <w:top w:type="dxa" w:w="50"/>
-              <w:left w:type="dxa" w:w="90"/>
-              <w:bottom w:type="dxa" w:w="50"/>
-              <w:right w:type="dxa" w:w="90"/>
-            </w:tcMar>
-          </w:tcPr>
-          <w:p>
-            <w:pPr>
-              <w:spacing w:after="0" w:line="250"/>
-            </w:pPr>
-            <w:r>
-              <w:rPr>
-                <w:rFonts w:ascii="Calibri" w:cs="Calibri" w:eastAsia="Calibri" w:hAnsi="Calibri"/>
-                <w:b w:val="false"/>
-                <w:bCs w:val="false"/>
-                <w:color w:val="23272F"/>
-                <w:sz w:val="17"/>
-                <w:szCs w:val="17"/>
-              </w:rPr>
-              <w:t xml:space="preserve">A acordar</w:t>
             </w:r>
           </w:p>
         </w:tc>
@@ -2287,7 +2325,7 @@
           <w:sz w:val="21"/>
           <w:szCs w:val="21"/>
         </w:rPr>
-        <w:t xml:space="preserve">Servidor (VM Linux) para hospedar a aplicação e permissão para uso de container.</w:t>
+        <w:t xml:space="preserve">App Registration com leitura no site do SharePoint da base.</w:t>
       </w:r>
     </w:p>
     <w:p>
@@ -2306,7 +2344,7 @@
           <w:sz w:val="21"/>
           <w:szCs w:val="21"/>
         </w:rPr>
-        <w:t xml:space="preserve">Banco de dados (PostgreSQL ou SQL Server) e credenciais com privilégio adequado.</w:t>
+        <w:t xml:space="preserve">Lista inicial dos usuários da equipe e seus perfis.</w:t>
       </w:r>
     </w:p>
     <w:p>
@@ -2325,45 +2363,7 @@
           <w:sz w:val="21"/>
           <w:szCs w:val="21"/>
         </w:rPr>
-        <w:t xml:space="preserve">Acesso de leitura ao SharePoint.</w:t>
-      </w:r>
-    </w:p>
-    <w:p>
-      <w:pPr>
-        <w:pStyle w:val="ListParagraph"/>
-        <w:numPr>
-          <w:ilvl w:val="0"/>
-          <w:numId w:val="1"/>
-        </w:numPr>
-        <w:spacing w:after="60" w:line="270"/>
-      </w:pPr>
-      <w:r>
-        <w:rPr>
-          <w:rFonts w:ascii="Calibri" w:cs="Calibri" w:eastAsia="Calibri" w:hAnsi="Calibri"/>
-          <w:color w:val="23272F"/>
-          <w:sz w:val="21"/>
-          <w:szCs w:val="21"/>
-        </w:rPr>
-        <w:t xml:space="preserve">Publicação segura da consulta do colaborador (reverse proxy / DMZ).</w:t>
-      </w:r>
-    </w:p>
-    <w:p>
-      <w:pPr>
-        <w:pStyle w:val="ListParagraph"/>
-        <w:numPr>
-          <w:ilvl w:val="0"/>
-          <w:numId w:val="1"/>
-        </w:numPr>
-        <w:spacing w:after="60" w:line="270"/>
-      </w:pPr>
-      <w:r>
-        <w:rPr>
-          <w:rFonts w:ascii="Calibri" w:cs="Calibri" w:eastAsia="Calibri" w:hAnsi="Calibri"/>
-          <w:color w:val="23272F"/>
-          <w:sz w:val="21"/>
-          <w:szCs w:val="21"/>
-        </w:rPr>
-        <w:t xml:space="preserve">Pipeline de deploy aceito e pontos focais de rede e segurança.</w:t>
+        <w:t xml:space="preserve">Subdomínio para publicação (opcional).</w:t>
       </w:r>
     </w:p>
     <w:p>
@@ -2380,7 +2380,7 @@
           <w:sz w:val="23"/>
           <w:szCs w:val="23"/>
         </w:rPr>
-        <w:t xml:space="preserve">Ponto de atenção</w:t>
+        <w:t xml:space="preserve">Consideração</w:t>
       </w:r>
     </w:p>
     <w:p>
@@ -2394,7 +2394,7 @@
           <w:sz w:val="21"/>
           <w:szCs w:val="21"/>
         </w:rPr>
-        <w:t xml:space="preserve">A consulta é feita no celular pessoal do colaborador, fora da rede. Para funcionar, a aplicação precisa ser publicada para a internet por um reverse proxy / DMZ. Se a exposição externa não for permitida, a consulta fica restrita a dispositivos internos, o que altera o escopo.</w:t>
+        <w:t xml:space="preserve">Uma cópia tratada dos dados fica no ambiente da DriveData. É o cenário de menor esforço e prazo, e a consulta do colaborador já é acessível pela internet. Corresponde ao modelo de assinatura (SaaS) da proposta.</w:t>
       </w:r>
     </w:p>
     <w:p>
@@ -2735,7 +2735,7 @@
                 <w:sz w:val="17"/>
                 <w:szCs w:val="17"/>
               </w:rPr>
-              <w:t xml:space="preserve">Cenário A (DriveData)</w:t>
+              <w:t xml:space="preserve">Cenário A (Unilever)</w:t>
             </w:r>
           </w:p>
         </w:tc>
@@ -2760,7 +2760,7 @@
                 <w:sz w:val="17"/>
                 <w:szCs w:val="17"/>
               </w:rPr>
-              <w:t xml:space="preserve">Cenário B (Unilever)</w:t>
+              <w:t xml:space="preserve">Cenário B (DriveData)</w:t>
             </w:r>
           </w:p>
         </w:tc>
@@ -2818,7 +2818,7 @@
                 <w:sz w:val="17"/>
                 <w:szCs w:val="17"/>
               </w:rPr>
-              <w:t xml:space="preserve">Cópia no ambiente DriveData</w:t>
+              <w:t xml:space="preserve">100% no ambiente Unilever</w:t>
             </w:r>
           </w:p>
         </w:tc>
@@ -2846,7 +2846,7 @@
                 <w:sz w:val="17"/>
                 <w:szCs w:val="17"/>
               </w:rPr>
-              <w:t xml:space="preserve">100% no ambiente Unilever</w:t>
+              <w:t xml:space="preserve">Cópia no ambiente DriveData</w:t>
             </w:r>
           </w:p>
         </w:tc>
@@ -2904,7 +2904,7 @@
                 <w:sz w:val="17"/>
                 <w:szCs w:val="17"/>
               </w:rPr>
-              <w:t xml:space="preserve">Já pública (nuvem)</w:t>
+              <w:t xml:space="preserve">Via reverse proxy / DMZ da Unilever</w:t>
             </w:r>
           </w:p>
         </w:tc>
@@ -2932,7 +2932,7 @@
                 <w:sz w:val="17"/>
                 <w:szCs w:val="17"/>
               </w:rPr>
-              <w:t xml:space="preserve">Via reverse proxy / DMZ da Unilever</w:t>
+              <w:t xml:space="preserve">Já pública (nuvem)</w:t>
             </w:r>
           </w:p>
         </w:tc>
@@ -2990,7 +2990,7 @@
                 <w:sz w:val="17"/>
                 <w:szCs w:val="17"/>
               </w:rPr>
-              <w:t xml:space="preserve">PostgreSQL gerenciado</w:t>
+              <w:t xml:space="preserve">PostgreSQL ou SQL Server da Unilever</w:t>
             </w:r>
           </w:p>
         </w:tc>
@@ -3018,7 +3018,7 @@
                 <w:sz w:val="17"/>
                 <w:szCs w:val="17"/>
               </w:rPr>
-              <w:t xml:space="preserve">PostgreSQL ou SQL Server da Unilever</w:t>
+              <w:t xml:space="preserve">PostgreSQL gerenciado</w:t>
             </w:r>
           </w:p>
         </w:tc>
@@ -3076,7 +3076,7 @@
                 <w:sz w:val="17"/>
                 <w:szCs w:val="17"/>
               </w:rPr>
-              <w:t xml:space="preserve">Baixo</w:t>
+              <w:t xml:space="preserve">Maior (ambiente do zero)</w:t>
             </w:r>
           </w:p>
         </w:tc>
@@ -3104,7 +3104,7 @@
                 <w:sz w:val="17"/>
                 <w:szCs w:val="17"/>
               </w:rPr>
-              <w:t xml:space="preserve">Maior (ambiente do zero)</w:t>
+              <w:t xml:space="preserve">Baixo</w:t>
             </w:r>
           </w:p>
         </w:tc>
@@ -3162,7 +3162,7 @@
                 <w:sz w:val="17"/>
                 <w:szCs w:val="17"/>
               </w:rPr>
-              <w:t xml:space="preserve">Baixa (apenas SharePoint)</w:t>
+              <w:t xml:space="preserve">Alta (servidor, rede, pipeline)</w:t>
             </w:r>
           </w:p>
         </w:tc>
@@ -3190,7 +3190,7 @@
                 <w:sz w:val="17"/>
                 <w:szCs w:val="17"/>
               </w:rPr>
-              <w:t xml:space="preserve">Alta (servidor, rede, pipeline)</w:t>
+              <w:t xml:space="preserve">Baixa (apenas SharePoint)</w:t>
             </w:r>
           </w:p>
         </w:tc>
@@ -3248,7 +3248,7 @@
                 <w:sz w:val="17"/>
                 <w:szCs w:val="17"/>
               </w:rPr>
-              <w:t xml:space="preserve">9 semanas</w:t>
+              <w:t xml:space="preserve">12 a 14 semanas</w:t>
             </w:r>
           </w:p>
         </w:tc>
@@ -3276,7 +3276,7 @@
                 <w:sz w:val="17"/>
                 <w:szCs w:val="17"/>
               </w:rPr>
-              <w:t xml:space="preserve">12 a 14 semanas</w:t>
+              <w:t xml:space="preserve">9 semanas</w:t>
             </w:r>
           </w:p>
         </w:tc>
@@ -3334,7 +3334,7 @@
           <w:sz w:val="21"/>
           <w:szCs w:val="21"/>
         </w:rPr>
-        <w:t xml:space="preserve">Cenário B: fornecem VM Linux? Qual sistema operacional e versão? Uso de container é permitido?</w:t>
+        <w:t xml:space="preserve">Cenário A: fornecem VM Linux? Qual sistema operacional e versão? Uso de container é permitido?</w:t>
       </w:r>
     </w:p>
     <w:p>
@@ -3353,7 +3353,7 @@
           <w:sz w:val="21"/>
           <w:szCs w:val="21"/>
         </w:rPr>
-        <w:t xml:space="preserve">Cenário B: o banco será PostgreSQL ou SQL Server? Qual versão?</w:t>
+        <w:t xml:space="preserve">Cenário A: o banco será PostgreSQL ou SQL Server? Qual versão?</w:t>
       </w:r>
     </w:p>
     <w:p>

</xml_diff>